<commit_message>
Refactor chapter6 generator; add assets & draft
Add refreshed Chapter 6 draft and generated plot assets, and refactor scripts/populate_chapter6.py to produce a richer report. The script now introduces ASSET_DIR, JOB_ORDER and JOB_LABELS, new dataclasses (GrainStats, expanded FitStats), concise helper parsers (_f/_i/_pct/_pm), refactored job/grain/fit readers, and robust plotting (_overview_plot, _crossover_plot) and table/figure helpers. Document text generation was rewritten to use the new structures, produce PNG assets, and simplify CLI arguments. Also add two generated images and a refreshed .docx draft to docs/Thesis.
</commit_message>
<xml_diff>
--- a/docs/Thesis/Chapter6_Stage1_Results_Feasibility_DRAFT.docx
+++ b/docs/Thesis/Chapter6_Stage1_Results_Feasibility_DRAFT.docx
@@ -12,7 +12,7 @@
     </w:p>
     <w:p>
       <w:r>
-        <w:t>Draft generated: 2026-03-05 15:55</w:t>
+        <w:t>Draft generated: 2026-03-05 17:28</w:t>
       </w:r>
     </w:p>
     <w:p>
@@ -748,7 +748,7 @@
     </w:p>
     <w:p>
       <w:r>
-        <w:t>To test whether the retained candidate population remained physically plausible, particle diameter was filtered to the configured 350-550 nm window and then summarized across the current Stage 1 dataset. Under the current outputs, the retained mean diameter was 432.91 +/- 56.66 nm for the 10 wt% system and 439.07 +/- 58.20 nm for the 25 wt% system.</w:t>
+        <w:t>To test whether the retained candidate population remained physically plausible, particle diameter was filtered to the configured 350-550 nm window and then summarized across the current Stage 1 dataset. Under the current outputs, the retained mean diameter was 432.91 +/- 56.66 nm for the 10 wt% system and 442.23 +/- 57.60 nm for the 25 wt% system.</w:t>
       </w:r>
     </w:p>
     <w:p>
@@ -891,7 +891,7 @@
           </w:tcPr>
           <w:p>
             <w:r>
-              <w:t>439.07</w:t>
+              <w:t>442.23</w:t>
             </w:r>
           </w:p>
         </w:tc>
@@ -901,7 +901,7 @@
           </w:tcPr>
           <w:p>
             <w:r>
-              <w:t>58.20</w:t>
+              <w:t>57.60</w:t>
             </w:r>
           </w:p>
         </w:tc>
@@ -1988,7 +1988,7 @@
     </w:p>
     <w:p>
       <w:r>
-        <w:t>The percentage of scans containing at least one isolated particle likewise dropped from 95.6% to 50.5% in the 10 wt% set and from 95.5% to 49.8% in the 25 wt% set. Even so, the current inventories still exceed the corresponding flatten-route scan requirements of 44 scans for 10 wt% and 51 scans for 25 wt%.</w:t>
+        <w:t>The percentage of scans containing at least one isolated particle likewise dropped from 95.6% to 50.5% in the 10 wt% set and from 95.5% to 49.8% in the 25 wt% set. Even so, the current inventories still exceed the corresponding flatten-route scan requirements of 44 scans for 10 wt% and 50 scans for 25 wt%.</w:t>
       </w:r>
     </w:p>
     <w:p>
@@ -2198,7 +2198,7 @@
           </w:tcPr>
           <w:p>
             <w:r>
-              <w:t>51</w:t>
+              <w:t>50</w:t>
             </w:r>
           </w:p>
         </w:tc>

</xml_diff>